<commit_message>
chore: archive consolidated dashboard files
Move planner-dashboard, venue-dashboard, property-dashboard,
service-provider-dashboard, jobs-dashboard, and post-job files to _archive/
as their functionality is now consolidated into requester-dashboard and
truck-dashboard. Updates market research lead databases and Cloudflare
analytics token placement.

Co-Authored-By: Claude Haiku 4.5 <noreply@anthropic.com>
</commit_message>
<xml_diff>
--- a/Market Research/1 - Food Trucks/Food Trucks - Contact Database.docx
+++ b/Market Research/1 - Food Trucks/Food Trucks - Contact Database.docx
@@ -31,7 +31,7 @@
           <w:sz w:val="18"/>
           <w:szCs w:val="18"/>
         </w:rPr>
-        <w:t xml:space="preserve">ServiceWindow Market Research  |  SWFL  |  Compiled April 5, 2026</w:t>
+        <w:t xml:space="preserve">ServiceWindow Market Research  |  SWFL  |  Compiled April 6, 2026</w:t>
       </w:r>
     </w:p>
     <w:p>
@@ -59,7 +59,7 @@
           <w:sz w:val="18"/>
           <w:szCs w:val="18"/>
         </w:rPr>
-        <w:t xml:space="preserve">53 entries</w:t>
+        <w:t xml:space="preserve">55 entries</w:t>
       </w:r>
     </w:p>
     <w:p>
@@ -632,6 +632,14 @@
     </w:tbl>
     <w:p>
       <w:pPr>
+        <w:spacing w:after="60" w:before="60"/>
+      </w:pPr>
+      <w:r>
+        <w:t xml:space="preserve"/>
+      </w:r>
+    </w:p>
+    <w:p>
+      <w:pPr>
         <w:pStyle w:val="Heading2"/>
         <w:pBdr>
           <w:bottom w:val="single" w:color="1B4F72" w:sz="4"/>
@@ -1257,6 +1265,14 @@
         </w:tc>
       </w:tr>
     </w:tbl>
+    <w:p>
+      <w:pPr>
+        <w:spacing w:after="60" w:before="60"/>
+      </w:pPr>
+      <w:r>
+        <w:t xml:space="preserve"/>
+      </w:r>
+    </w:p>
     <w:p>
       <w:pPr>
         <w:pStyle w:val="Heading2"/>
@@ -1768,6 +1784,14 @@
     </w:tbl>
     <w:p>
       <w:pPr>
+        <w:spacing w:after="60" w:before="60"/>
+      </w:pPr>
+      <w:r>
+        <w:t xml:space="preserve"/>
+      </w:r>
+    </w:p>
+    <w:p>
+      <w:pPr>
         <w:pStyle w:val="Heading2"/>
         <w:pBdr>
           <w:bottom w:val="single" w:color="1B4F72" w:sz="4"/>
@@ -2275,6 +2299,14 @@
         </w:tc>
       </w:tr>
     </w:tbl>
+    <w:p>
+      <w:pPr>
+        <w:spacing w:after="60" w:before="60"/>
+      </w:pPr>
+      <w:r>
+        <w:t xml:space="preserve"/>
+      </w:r>
+    </w:p>
     <w:p>
       <w:pPr>
         <w:pStyle w:val="Heading2"/>
@@ -2727,6 +2759,14 @@
     </w:tbl>
     <w:p>
       <w:pPr>
+        <w:spacing w:after="60" w:before="60"/>
+      </w:pPr>
+      <w:r>
+        <w:t xml:space="preserve"/>
+      </w:r>
+    </w:p>
+    <w:p>
+      <w:pPr>
         <w:pStyle w:val="Heading2"/>
         <w:pBdr>
           <w:bottom w:val="single" w:color="1B4F72" w:sz="4"/>
@@ -3175,6 +3215,14 @@
         </w:tc>
       </w:tr>
     </w:tbl>
+    <w:p>
+      <w:pPr>
+        <w:spacing w:after="60" w:before="60"/>
+      </w:pPr>
+      <w:r>
+        <w:t xml:space="preserve"/>
+      </w:r>
+    </w:p>
     <w:p>
       <w:pPr>
         <w:pStyle w:val="Heading2"/>
@@ -3745,6 +3793,14 @@
     </w:tbl>
     <w:p>
       <w:pPr>
+        <w:spacing w:after="60" w:before="60"/>
+      </w:pPr>
+      <w:r>
+        <w:t xml:space="preserve"/>
+      </w:r>
+    </w:p>
+    <w:p>
+      <w:pPr>
         <w:pStyle w:val="Heading2"/>
         <w:pBdr>
           <w:bottom w:val="single" w:color="1B4F72" w:sz="4"/>
@@ -4134,6 +4190,14 @@
         </w:tc>
       </w:tr>
     </w:tbl>
+    <w:p>
+      <w:pPr>
+        <w:spacing w:after="60" w:before="60"/>
+      </w:pPr>
+      <w:r>
+        <w:t xml:space="preserve"/>
+      </w:r>
+    </w:p>
     <w:p>
       <w:pPr>
         <w:pStyle w:val="Heading2"/>
@@ -4586,6 +4650,14 @@
     </w:tbl>
     <w:p>
       <w:pPr>
+        <w:spacing w:after="60" w:before="60"/>
+      </w:pPr>
+      <w:r>
+        <w:t xml:space="preserve"/>
+      </w:r>
+    </w:p>
+    <w:p>
+      <w:pPr>
         <w:pStyle w:val="Heading2"/>
         <w:pBdr>
           <w:bottom w:val="single" w:color="1B4F72" w:sz="4"/>
@@ -4916,6 +4988,14 @@
         </w:tc>
       </w:tr>
     </w:tbl>
+    <w:p>
+      <w:pPr>
+        <w:spacing w:after="60" w:before="60"/>
+      </w:pPr>
+      <w:r>
+        <w:t xml:space="preserve"/>
+      </w:r>
+    </w:p>
     <w:p>
       <w:pPr>
         <w:pStyle w:val="Heading2"/>
@@ -5250,6 +5330,14 @@
     </w:tbl>
     <w:p>
       <w:pPr>
+        <w:spacing w:after="60" w:before="60"/>
+      </w:pPr>
+      <w:r>
+        <w:t xml:space="preserve"/>
+      </w:r>
+    </w:p>
+    <w:p>
+      <w:pPr>
         <w:pStyle w:val="Heading2"/>
         <w:pBdr>
           <w:bottom w:val="single" w:color="1B4F72" w:sz="4"/>
@@ -5521,6 +5609,14 @@
         </w:tc>
       </w:tr>
     </w:tbl>
+    <w:p>
+      <w:pPr>
+        <w:spacing w:after="60" w:before="60"/>
+      </w:pPr>
+      <w:r>
+        <w:t xml:space="preserve"/>
+      </w:r>
+    </w:p>
     <w:p>
       <w:pPr>
         <w:pStyle w:val="Heading2"/>
@@ -5855,6 +5951,14 @@
     </w:tbl>
     <w:p>
       <w:pPr>
+        <w:spacing w:after="60" w:before="60"/>
+      </w:pPr>
+      <w:r>
+        <w:t xml:space="preserve"/>
+      </w:r>
+    </w:p>
+    <w:p>
+      <w:pPr>
         <w:pStyle w:val="Heading2"/>
         <w:pBdr>
           <w:bottom w:val="single" w:color="1B4F72" w:sz="4"/>
@@ -6185,6 +6289,14 @@
         </w:tc>
       </w:tr>
     </w:tbl>
+    <w:p>
+      <w:pPr>
+        <w:spacing w:after="60" w:before="60"/>
+      </w:pPr>
+      <w:r>
+        <w:t xml:space="preserve"/>
+      </w:r>
+    </w:p>
     <w:p>
       <w:pPr>
         <w:pStyle w:val="Heading2"/>
@@ -6460,6 +6572,14 @@
     </w:tbl>
     <w:p>
       <w:pPr>
+        <w:spacing w:after="60" w:before="60"/>
+      </w:pPr>
+      <w:r>
+        <w:t xml:space="preserve"/>
+      </w:r>
+    </w:p>
+    <w:p>
+      <w:pPr>
         <w:pStyle w:val="Heading2"/>
         <w:pBdr>
           <w:bottom w:val="single" w:color="1B4F72" w:sz="4"/>
@@ -6731,6 +6851,14 @@
         </w:tc>
       </w:tr>
     </w:tbl>
+    <w:p>
+      <w:pPr>
+        <w:spacing w:after="60" w:before="60"/>
+      </w:pPr>
+      <w:r>
+        <w:t xml:space="preserve"/>
+      </w:r>
+    </w:p>
     <w:p>
       <w:pPr>
         <w:pStyle w:val="Heading2"/>
@@ -7006,6 +7134,14 @@
     </w:tbl>
     <w:p>
       <w:pPr>
+        <w:spacing w:after="60" w:before="60"/>
+      </w:pPr>
+      <w:r>
+        <w:t xml:space="preserve"/>
+      </w:r>
+    </w:p>
+    <w:p>
+      <w:pPr>
         <w:pStyle w:val="Heading2"/>
         <w:pBdr>
           <w:bottom w:val="single" w:color="1B4F72" w:sz="4"/>
@@ -7277,6 +7413,14 @@
         </w:tc>
       </w:tr>
     </w:tbl>
+    <w:p>
+      <w:pPr>
+        <w:spacing w:after="60" w:before="60"/>
+      </w:pPr>
+      <w:r>
+        <w:t xml:space="preserve"/>
+      </w:r>
+    </w:p>
     <w:p>
       <w:pPr>
         <w:pStyle w:val="Heading2"/>
@@ -7552,6 +7696,14 @@
     </w:tbl>
     <w:p>
       <w:pPr>
+        <w:spacing w:after="60" w:before="60"/>
+      </w:pPr>
+      <w:r>
+        <w:t xml:space="preserve"/>
+      </w:r>
+    </w:p>
+    <w:p>
+      <w:pPr>
         <w:pStyle w:val="Heading2"/>
         <w:pBdr>
           <w:bottom w:val="single" w:color="1B4F72" w:sz="4"/>
@@ -8000,6 +8152,14 @@
         </w:tc>
       </w:tr>
     </w:tbl>
+    <w:p>
+      <w:pPr>
+        <w:spacing w:after="60" w:before="60"/>
+      </w:pPr>
+      <w:r>
+        <w:t xml:space="preserve"/>
+      </w:r>
+    </w:p>
     <w:p>
       <w:pPr>
         <w:pStyle w:val="Heading2"/>
@@ -8275,6 +8435,14 @@
     </w:tbl>
     <w:p>
       <w:pPr>
+        <w:spacing w:after="60" w:before="60"/>
+      </w:pPr>
+      <w:r>
+        <w:t xml:space="preserve"/>
+      </w:r>
+    </w:p>
+    <w:p>
+      <w:pPr>
         <w:pStyle w:val="Heading2"/>
         <w:pBdr>
           <w:bottom w:val="single" w:color="1B4F72" w:sz="4"/>
@@ -8487,6 +8655,14 @@
         </w:tc>
       </w:tr>
     </w:tbl>
+    <w:p>
+      <w:pPr>
+        <w:spacing w:after="60" w:before="60"/>
+      </w:pPr>
+      <w:r>
+        <w:t xml:space="preserve"/>
+      </w:r>
+    </w:p>
     <w:p>
       <w:pPr>
         <w:pStyle w:val="Heading2"/>
@@ -8821,6 +8997,14 @@
     </w:tbl>
     <w:p>
       <w:pPr>
+        <w:spacing w:after="60" w:before="60"/>
+      </w:pPr>
+      <w:r>
+        <w:t xml:space="preserve"/>
+      </w:r>
+    </w:p>
+    <w:p>
+      <w:pPr>
         <w:pStyle w:val="Heading2"/>
         <w:pBdr>
           <w:bottom w:val="single" w:color="1B4F72" w:sz="4"/>
@@ -9210,6 +9394,14 @@
         </w:tc>
       </w:tr>
     </w:tbl>
+    <w:p>
+      <w:pPr>
+        <w:spacing w:after="60" w:before="60"/>
+      </w:pPr>
+      <w:r>
+        <w:t xml:space="preserve"/>
+      </w:r>
+    </w:p>
     <w:p>
       <w:pPr>
         <w:pStyle w:val="Heading2"/>
@@ -9544,6 +9736,14 @@
     </w:tbl>
     <w:p>
       <w:pPr>
+        <w:spacing w:after="60" w:before="60"/>
+      </w:pPr>
+      <w:r>
+        <w:t xml:space="preserve"/>
+      </w:r>
+    </w:p>
+    <w:p>
+      <w:pPr>
         <w:pStyle w:val="Heading2"/>
         <w:pBdr>
           <w:bottom w:val="single" w:color="1B4F72" w:sz="4"/>
@@ -9815,6 +10015,14 @@
         </w:tc>
       </w:tr>
     </w:tbl>
+    <w:p>
+      <w:pPr>
+        <w:spacing w:after="60" w:before="60"/>
+      </w:pPr>
+      <w:r>
+        <w:t xml:space="preserve"/>
+      </w:r>
+    </w:p>
     <w:p>
       <w:pPr>
         <w:pStyle w:val="Heading2"/>
@@ -10090,6 +10298,14 @@
     </w:tbl>
     <w:p>
       <w:pPr>
+        <w:spacing w:after="60" w:before="60"/>
+      </w:pPr>
+      <w:r>
+        <w:t xml:space="preserve"/>
+      </w:r>
+    </w:p>
+    <w:p>
+      <w:pPr>
         <w:pStyle w:val="Heading2"/>
         <w:pBdr>
           <w:bottom w:val="single" w:color="1B4F72" w:sz="4"/>
@@ -10361,6 +10577,14 @@
         </w:tc>
       </w:tr>
     </w:tbl>
+    <w:p>
+      <w:pPr>
+        <w:spacing w:after="60" w:before="60"/>
+      </w:pPr>
+      <w:r>
+        <w:t xml:space="preserve"/>
+      </w:r>
+    </w:p>
     <w:p>
       <w:pPr>
         <w:pStyle w:val="Heading2"/>
@@ -10695,6 +10919,14 @@
     </w:tbl>
     <w:p>
       <w:pPr>
+        <w:spacing w:after="60" w:before="60"/>
+      </w:pPr>
+      <w:r>
+        <w:t xml:space="preserve"/>
+      </w:r>
+    </w:p>
+    <w:p>
+      <w:pPr>
         <w:pStyle w:val="Heading2"/>
         <w:pBdr>
           <w:bottom w:val="single" w:color="1B4F72" w:sz="4"/>
@@ -11202,6 +11434,14 @@
         </w:tc>
       </w:tr>
     </w:tbl>
+    <w:p>
+      <w:pPr>
+        <w:spacing w:after="60" w:before="60"/>
+      </w:pPr>
+      <w:r>
+        <w:t xml:space="preserve"/>
+      </w:r>
+    </w:p>
     <w:p>
       <w:pPr>
         <w:pStyle w:val="Heading2"/>
@@ -11324,6 +11564,65 @@
                 <w:sz w:val="18"/>
                 <w:szCs w:val="18"/>
               </w:rPr>
+              <w:t xml:space="preserve">Email</w:t>
+            </w:r>
+          </w:p>
+        </w:tc>
+        <w:tc>
+          <w:tcPr>
+            <w:tcW w:type="dxa" w:w="7560"/>
+            <w:tcBorders>
+              <w:top w:val="single" w:color="CCCCCC" w:sz="1"/>
+              <w:left w:val="single" w:color="CCCCCC" w:sz="1"/>
+              <w:bottom w:val="single" w:color="CCCCCC" w:sz="1"/>
+              <w:right w:val="single" w:color="CCCCCC" w:sz="1"/>
+            </w:tcBorders>
+            <w:tcMar>
+              <w:top w:type="dxa" w:w="80"/>
+              <w:left w:type="dxa" w:w="120"/>
+              <w:bottom w:type="dxa" w:w="80"/>
+              <w:right w:type="dxa" w:w="120"/>
+            </w:tcMar>
+          </w:tcPr>
+          <w:p>
+            <w:r>
+              <w:rPr>
+                <w:rFonts w:ascii="Arial" w:cs="Arial" w:eastAsia="Arial" w:hAnsi="Arial"/>
+                <w:sz w:val="18"/>
+                <w:szCs w:val="18"/>
+              </w:rPr>
+              <w:t xml:space="preserve">CountriesCoffee@Outlook.com</w:t>
+            </w:r>
+          </w:p>
+        </w:tc>
+      </w:tr>
+      <w:tr>
+        <w:tc>
+          <w:tcPr>
+            <w:tcW w:type="dxa" w:w="1800"/>
+            <w:tcBorders>
+              <w:top w:val="single" w:color="CCCCCC" w:sz="1"/>
+              <w:left w:val="single" w:color="CCCCCC" w:sz="1"/>
+              <w:bottom w:val="single" w:color="CCCCCC" w:sz="1"/>
+              <w:right w:val="single" w:color="CCCCCC" w:sz="1"/>
+            </w:tcBorders>
+            <w:shd w:fill="F2F3F4" w:val="clear"/>
+            <w:tcMar>
+              <w:top w:type="dxa" w:w="80"/>
+              <w:left w:type="dxa" w:w="120"/>
+              <w:bottom w:type="dxa" w:w="80"/>
+              <w:right w:type="dxa" w:w="120"/>
+            </w:tcMar>
+          </w:tcPr>
+          <w:p>
+            <w:r>
+              <w:rPr>
+                <w:rFonts w:ascii="Arial" w:cs="Arial" w:eastAsia="Arial" w:hAnsi="Arial"/>
+                <w:b/>
+                <w:bCs/>
+                <w:sz w:val="18"/>
+                <w:szCs w:val="18"/>
+              </w:rPr>
               <w:t xml:space="preserve">Facebook</w:t>
             </w:r>
           </w:p>
@@ -11528,12 +11827,21 @@
                 <w:sz w:val="18"/>
                 <w:szCs w:val="18"/>
               </w:rPr>
-              <w:t xml:space="preserve">Active at multiple farmers markets: Marco Island FM, Cape Coral FM, Pine Ridge Rd FM.</w:t>
+              <w:t xml:space="preserve">Active at multiple farmers markets: Marco Island FM, Cape Coral FM, Pine Ridge Rd FM.
+[2026-04-06] Weekly schedule posted (Apr 6-12): Tue (St. John's FM Naples), Wed (Marco Island FM), Thu (Isles of Collier Naples + Keiser U Naples), Sat (Cape Coral FM), Sun (Pine Ridge FM). Multi-market circuit confirmed.</w:t>
             </w:r>
           </w:p>
         </w:tc>
       </w:tr>
     </w:tbl>
+    <w:p>
+      <w:pPr>
+        <w:spacing w:after="60" w:before="60"/>
+      </w:pPr>
+      <w:r>
+        <w:t xml:space="preserve"/>
+      </w:r>
+    </w:p>
     <w:p>
       <w:pPr>
         <w:pStyle w:val="Heading2"/>
@@ -11927,6 +12235,14 @@
     </w:tbl>
     <w:p>
       <w:pPr>
+        <w:spacing w:after="60" w:before="60"/>
+      </w:pPr>
+      <w:r>
+        <w:t xml:space="preserve"/>
+      </w:r>
+    </w:p>
+    <w:p>
+      <w:pPr>
         <w:pStyle w:val="Heading2"/>
         <w:pBdr>
           <w:bottom w:val="single" w:color="1B4F72" w:sz="4"/>
@@ -12139,6 +12455,14 @@
         </w:tc>
       </w:tr>
     </w:tbl>
+    <w:p>
+      <w:pPr>
+        <w:spacing w:after="60" w:before="60"/>
+      </w:pPr>
+      <w:r>
+        <w:t xml:space="preserve"/>
+      </w:r>
+    </w:p>
     <w:p>
       <w:pPr>
         <w:pStyle w:val="Heading2"/>
@@ -12414,6 +12738,14 @@
     </w:tbl>
     <w:p>
       <w:pPr>
+        <w:spacing w:after="60" w:before="60"/>
+      </w:pPr>
+      <w:r>
+        <w:t xml:space="preserve"/>
+      </w:r>
+    </w:p>
+    <w:p>
+      <w:pPr>
         <w:pStyle w:val="Heading2"/>
         <w:pBdr>
           <w:bottom w:val="single" w:color="1B4F72" w:sz="4"/>
@@ -12626,6 +12958,14 @@
         </w:tc>
       </w:tr>
     </w:tbl>
+    <w:p>
+      <w:pPr>
+        <w:spacing w:after="60" w:before="60"/>
+      </w:pPr>
+      <w:r>
+        <w:t xml:space="preserve"/>
+      </w:r>
+    </w:p>
     <w:p>
       <w:pPr>
         <w:pStyle w:val="Heading2"/>
@@ -12901,6 +13241,14 @@
     </w:tbl>
     <w:p>
       <w:pPr>
+        <w:spacing w:after="60" w:before="60"/>
+      </w:pPr>
+      <w:r>
+        <w:t xml:space="preserve"/>
+      </w:r>
+    </w:p>
+    <w:p>
+      <w:pPr>
         <w:pStyle w:val="Heading2"/>
         <w:pBdr>
           <w:bottom w:val="single" w:color="1B4F72" w:sz="4"/>
@@ -13290,6 +13638,14 @@
         </w:tc>
       </w:tr>
     </w:tbl>
+    <w:p>
+      <w:pPr>
+        <w:spacing w:after="60" w:before="60"/>
+      </w:pPr>
+      <w:r>
+        <w:t xml:space="preserve"/>
+      </w:r>
+    </w:p>
     <w:p>
       <w:pPr>
         <w:pStyle w:val="Heading2"/>
@@ -13801,6 +14157,14 @@
     </w:tbl>
     <w:p>
       <w:pPr>
+        <w:spacing w:after="60" w:before="60"/>
+      </w:pPr>
+      <w:r>
+        <w:t xml:space="preserve"/>
+      </w:r>
+    </w:p>
+    <w:p>
+      <w:pPr>
         <w:pStyle w:val="Heading2"/>
         <w:pBdr>
           <w:bottom w:val="single" w:color="1B4F72" w:sz="4"/>
@@ -14249,6 +14613,14 @@
         </w:tc>
       </w:tr>
     </w:tbl>
+    <w:p>
+      <w:pPr>
+        <w:spacing w:after="60" w:before="60"/>
+      </w:pPr>
+      <w:r>
+        <w:t xml:space="preserve"/>
+      </w:r>
+    </w:p>
     <w:p>
       <w:pPr>
         <w:pStyle w:val="Heading2"/>
@@ -14819,6 +15191,14 @@
     </w:tbl>
     <w:p>
       <w:pPr>
+        <w:spacing w:after="60" w:before="60"/>
+      </w:pPr>
+      <w:r>
+        <w:t xml:space="preserve"/>
+      </w:r>
+    </w:p>
+    <w:p>
+      <w:pPr>
         <w:pStyle w:val="Heading2"/>
         <w:pBdr>
           <w:bottom w:val="single" w:color="1B4F72" w:sz="4"/>
@@ -15326,6 +15706,14 @@
         </w:tc>
       </w:tr>
     </w:tbl>
+    <w:p>
+      <w:pPr>
+        <w:spacing w:after="60" w:before="60"/>
+      </w:pPr>
+      <w:r>
+        <w:t xml:space="preserve"/>
+      </w:r>
+    </w:p>
     <w:p>
       <w:pPr>
         <w:pStyle w:val="Heading2"/>
@@ -15837,6 +16225,14 @@
     </w:tbl>
     <w:p>
       <w:pPr>
+        <w:spacing w:after="60" w:before="60"/>
+      </w:pPr>
+      <w:r>
+        <w:t xml:space="preserve"/>
+      </w:r>
+    </w:p>
+    <w:p>
+      <w:pPr>
         <w:pStyle w:val="Heading2"/>
         <w:pBdr>
           <w:bottom w:val="single" w:color="1B4F72" w:sz="4"/>
@@ -16338,12 +16734,21 @@
                 <w:sz w:val="18"/>
                 <w:szCs w:val="18"/>
               </w:rPr>
-              <w:t xml:space="preserve">Saturday crawfish delivery from Gainesville to Port Charlotte. Text orders to 239-895-7430 by Friday noon. No prepayment, no delivery fee.</w:t>
+              <w:t xml:space="preserve">Saturday crawfish delivery from Gainesville to Port Charlotte. Text orders to 239-895-7430 by Friday noon. No prepayment, no delivery fee.
+[2026-04-06] Weekly route expanded: Thursday statewide crawfish route + Saturday West Coast FL run confirmed. Marketing-forward operator (Reels/video content).</w:t>
             </w:r>
           </w:p>
         </w:tc>
       </w:tr>
     </w:tbl>
+    <w:p>
+      <w:pPr>
+        <w:spacing w:after="60" w:before="60"/>
+      </w:pPr>
+      <w:r>
+        <w:t xml:space="preserve"/>
+      </w:r>
+    </w:p>
     <w:p>
       <w:pPr>
         <w:pStyle w:val="Heading2"/>
@@ -16796,6 +17201,14 @@
     </w:tbl>
     <w:p>
       <w:pPr>
+        <w:spacing w:after="60" w:before="60"/>
+      </w:pPr>
+      <w:r>
+        <w:t xml:space="preserve"/>
+      </w:r>
+    </w:p>
+    <w:p>
+      <w:pPr>
         <w:pStyle w:val="Heading2"/>
         <w:pBdr>
           <w:bottom w:val="single" w:color="1B4F72" w:sz="4"/>
@@ -17244,6 +17657,14 @@
         </w:tc>
       </w:tr>
     </w:tbl>
+    <w:p>
+      <w:pPr>
+        <w:spacing w:after="60" w:before="60"/>
+      </w:pPr>
+      <w:r>
+        <w:t xml:space="preserve"/>
+      </w:r>
+    </w:p>
     <w:p>
       <w:pPr>
         <w:pStyle w:val="Heading2"/>
@@ -17637,6 +18058,14 @@
     </w:tbl>
     <w:p>
       <w:pPr>
+        <w:spacing w:after="60" w:before="60"/>
+      </w:pPr>
+      <w:r>
+        <w:t xml:space="preserve"/>
+      </w:r>
+    </w:p>
+    <w:p>
+      <w:pPr>
         <w:pStyle w:val="Heading2"/>
         <w:pBdr>
           <w:bottom w:val="single" w:color="1B4F72" w:sz="4"/>
@@ -17967,6 +18396,14 @@
         </w:tc>
       </w:tr>
     </w:tbl>
+    <w:p>
+      <w:pPr>
+        <w:spacing w:after="60" w:before="60"/>
+      </w:pPr>
+      <w:r>
+        <w:t xml:space="preserve"/>
+      </w:r>
+    </w:p>
     <w:p>
       <w:pPr>
         <w:pStyle w:val="Heading2"/>
@@ -18301,6 +18738,14 @@
     </w:tbl>
     <w:p>
       <w:pPr>
+        <w:spacing w:after="60" w:before="60"/>
+      </w:pPr>
+      <w:r>
+        <w:t xml:space="preserve"/>
+      </w:r>
+    </w:p>
+    <w:p>
+      <w:pPr>
         <w:pStyle w:val="Heading2"/>
         <w:pBdr>
           <w:bottom w:val="single" w:color="1B4F72" w:sz="4"/>
@@ -18631,6 +19076,14 @@
         </w:tc>
       </w:tr>
     </w:tbl>
+    <w:p>
+      <w:pPr>
+        <w:spacing w:after="60" w:before="60"/>
+      </w:pPr>
+      <w:r>
+        <w:t xml:space="preserve"/>
+      </w:r>
+    </w:p>
     <w:p>
       <w:pPr>
         <w:pStyle w:val="Heading2"/>
@@ -18965,6 +19418,14 @@
     </w:tbl>
     <w:p>
       <w:pPr>
+        <w:spacing w:after="60" w:before="60"/>
+      </w:pPr>
+      <w:r>
+        <w:t xml:space="preserve"/>
+      </w:r>
+    </w:p>
+    <w:p>
+      <w:pPr>
         <w:pStyle w:val="Heading2"/>
         <w:pBdr>
           <w:bottom w:val="single" w:color="1B4F72" w:sz="4"/>
@@ -19295,6 +19756,14 @@
         </w:tc>
       </w:tr>
     </w:tbl>
+    <w:p>
+      <w:pPr>
+        <w:spacing w:after="60" w:before="60"/>
+      </w:pPr>
+      <w:r>
+        <w:t xml:space="preserve"/>
+      </w:r>
+    </w:p>
     <w:p>
       <w:pPr>
         <w:pStyle w:val="Heading2"/>
@@ -19688,6 +20157,14 @@
     </w:tbl>
     <w:p>
       <w:pPr>
+        <w:spacing w:after="60" w:before="60"/>
+      </w:pPr>
+      <w:r>
+        <w:t xml:space="preserve"/>
+      </w:r>
+    </w:p>
+    <w:p>
+      <w:pPr>
         <w:pStyle w:val="Heading2"/>
         <w:pBdr>
           <w:bottom w:val="single" w:color="1B4F72" w:sz="4"/>
@@ -20136,9 +20613,757 @@
         </w:tc>
       </w:tr>
     </w:tbl>
+    <w:p>
+      <w:pPr>
+        <w:spacing w:after="60" w:before="60"/>
+      </w:pPr>
+      <w:r>
+        <w:t xml:space="preserve"/>
+      </w:r>
+    </w:p>
+    <w:p>
+      <w:pPr>
+        <w:pStyle w:val="Heading2"/>
+        <w:pBdr>
+          <w:bottom w:val="single" w:color="1B4F72" w:sz="4"/>
+        </w:pBdr>
+        <w:spacing w:after="60" w:before="320"/>
+      </w:pPr>
+      <w:r>
+        <w:rPr>
+          <w:rFonts w:ascii="Arial" w:cs="Arial" w:eastAsia="Arial" w:hAnsi="Arial"/>
+          <w:b/>
+          <w:bCs/>
+          <w:color w:val="1B4F72"/>
+          <w:sz w:val="26"/>
+          <w:szCs w:val="26"/>
+        </w:rPr>
+        <w:t xml:space="preserve">Polar Delites</w:t>
+      </w:r>
+    </w:p>
+    <w:tbl>
+      <w:tblPr>
+        <w:tblW w:type="dxa" w:w="9360"/>
+        <w:tblBorders>
+          <w:top w:val="single" w:color="auto" w:sz="4"/>
+          <w:left w:val="single" w:color="auto" w:sz="4"/>
+          <w:bottom w:val="single" w:color="auto" w:sz="4"/>
+          <w:right w:val="single" w:color="auto" w:sz="4"/>
+          <w:insideH w:val="single" w:color="auto" w:sz="4"/>
+          <w:insideV w:val="single" w:color="auto" w:sz="4"/>
+        </w:tblBorders>
+      </w:tblPr>
+      <w:tblGrid>
+        <w:gridCol w:w="1800"/>
+        <w:gridCol w:w="7560"/>
+      </w:tblGrid>
+      <w:tr>
+        <w:tc>
+          <w:tcPr>
+            <w:tcW w:type="dxa" w:w="1800"/>
+            <w:tcBorders>
+              <w:top w:val="single" w:color="CCCCCC" w:sz="1"/>
+              <w:left w:val="single" w:color="CCCCCC" w:sz="1"/>
+              <w:bottom w:val="single" w:color="CCCCCC" w:sz="1"/>
+              <w:right w:val="single" w:color="CCCCCC" w:sz="1"/>
+            </w:tcBorders>
+            <w:shd w:fill="F2F3F4" w:val="clear"/>
+            <w:tcMar>
+              <w:top w:type="dxa" w:w="80"/>
+              <w:left w:type="dxa" w:w="120"/>
+              <w:bottom w:type="dxa" w:w="80"/>
+              <w:right w:type="dxa" w:w="120"/>
+            </w:tcMar>
+          </w:tcPr>
+          <w:p>
+            <w:r>
+              <w:rPr>
+                <w:rFonts w:ascii="Arial" w:cs="Arial" w:eastAsia="Arial" w:hAnsi="Arial"/>
+                <w:b/>
+                <w:bCs/>
+                <w:sz w:val="18"/>
+                <w:szCs w:val="18"/>
+              </w:rPr>
+              <w:t xml:space="preserve">Source</w:t>
+            </w:r>
+          </w:p>
+        </w:tc>
+        <w:tc>
+          <w:tcPr>
+            <w:tcW w:type="dxa" w:w="7560"/>
+            <w:tcBorders>
+              <w:top w:val="single" w:color="CCCCCC" w:sz="1"/>
+              <w:left w:val="single" w:color="CCCCCC" w:sz="1"/>
+              <w:bottom w:val="single" w:color="CCCCCC" w:sz="1"/>
+              <w:right w:val="single" w:color="CCCCCC" w:sz="1"/>
+            </w:tcBorders>
+            <w:tcMar>
+              <w:top w:type="dxa" w:w="80"/>
+              <w:left w:type="dxa" w:w="120"/>
+              <w:bottom w:type="dxa" w:w="80"/>
+              <w:right w:type="dxa" w:w="120"/>
+            </w:tcMar>
+          </w:tcPr>
+          <w:p>
+            <w:r>
+              <w:rPr>
+                <w:rFonts w:ascii="Arial" w:cs="Arial" w:eastAsia="Arial" w:hAnsi="Arial"/>
+                <w:sz w:val="18"/>
+                <w:szCs w:val="18"/>
+              </w:rPr>
+              <w:t xml:space="preserve">SWFL Food Truck Depot</w:t>
+            </w:r>
+          </w:p>
+        </w:tc>
+      </w:tr>
+      <w:tr>
+        <w:tc>
+          <w:tcPr>
+            <w:tcW w:type="dxa" w:w="1800"/>
+            <w:tcBorders>
+              <w:top w:val="single" w:color="CCCCCC" w:sz="1"/>
+              <w:left w:val="single" w:color="CCCCCC" w:sz="1"/>
+              <w:bottom w:val="single" w:color="CCCCCC" w:sz="1"/>
+              <w:right w:val="single" w:color="CCCCCC" w:sz="1"/>
+            </w:tcBorders>
+            <w:shd w:fill="F2F3F4" w:val="clear"/>
+            <w:tcMar>
+              <w:top w:type="dxa" w:w="80"/>
+              <w:left w:type="dxa" w:w="120"/>
+              <w:bottom w:type="dxa" w:w="80"/>
+              <w:right w:type="dxa" w:w="120"/>
+            </w:tcMar>
+          </w:tcPr>
+          <w:p>
+            <w:r>
+              <w:rPr>
+                <w:rFonts w:ascii="Arial" w:cs="Arial" w:eastAsia="Arial" w:hAnsi="Arial"/>
+                <w:b/>
+                <w:bCs/>
+                <w:sz w:val="18"/>
+                <w:szCs w:val="18"/>
+              </w:rPr>
+              <w:t xml:space="preserve">Facebook</w:t>
+            </w:r>
+          </w:p>
+        </w:tc>
+        <w:tc>
+          <w:tcPr>
+            <w:tcW w:type="dxa" w:w="7560"/>
+            <w:tcBorders>
+              <w:top w:val="single" w:color="CCCCCC" w:sz="1"/>
+              <w:left w:val="single" w:color="CCCCCC" w:sz="1"/>
+              <w:bottom w:val="single" w:color="CCCCCC" w:sz="1"/>
+              <w:right w:val="single" w:color="CCCCCC" w:sz="1"/>
+            </w:tcBorders>
+            <w:tcMar>
+              <w:top w:type="dxa" w:w="80"/>
+              <w:left w:type="dxa" w:w="120"/>
+              <w:bottom w:type="dxa" w:w="80"/>
+              <w:right w:type="dxa" w:w="120"/>
+            </w:tcMar>
+          </w:tcPr>
+          <w:p>
+            <w:r>
+              <w:rPr>
+                <w:rFonts w:ascii="Arial" w:cs="Arial" w:eastAsia="Arial" w:hAnsi="Arial"/>
+                <w:sz w:val="18"/>
+                <w:szCs w:val="18"/>
+              </w:rPr>
+              <w:t xml:space="preserve">Polar Delites</w:t>
+            </w:r>
+          </w:p>
+        </w:tc>
+      </w:tr>
+      <w:tr>
+        <w:tc>
+          <w:tcPr>
+            <w:tcW w:type="dxa" w:w="1800"/>
+            <w:tcBorders>
+              <w:top w:val="single" w:color="CCCCCC" w:sz="1"/>
+              <w:left w:val="single" w:color="CCCCCC" w:sz="1"/>
+              <w:bottom w:val="single" w:color="CCCCCC" w:sz="1"/>
+              <w:right w:val="single" w:color="CCCCCC" w:sz="1"/>
+            </w:tcBorders>
+            <w:shd w:fill="F2F3F4" w:val="clear"/>
+            <w:tcMar>
+              <w:top w:type="dxa" w:w="80"/>
+              <w:left w:type="dxa" w:w="120"/>
+              <w:bottom w:type="dxa" w:w="80"/>
+              <w:right w:type="dxa" w:w="120"/>
+            </w:tcMar>
+          </w:tcPr>
+          <w:p>
+            <w:r>
+              <w:rPr>
+                <w:rFonts w:ascii="Arial" w:cs="Arial" w:eastAsia="Arial" w:hAnsi="Arial"/>
+                <w:b/>
+                <w:bCs/>
+                <w:sz w:val="18"/>
+                <w:szCs w:val="18"/>
+              </w:rPr>
+              <w:t xml:space="preserve">Location</w:t>
+            </w:r>
+          </w:p>
+        </w:tc>
+        <w:tc>
+          <w:tcPr>
+            <w:tcW w:type="dxa" w:w="7560"/>
+            <w:tcBorders>
+              <w:top w:val="single" w:color="CCCCCC" w:sz="1"/>
+              <w:left w:val="single" w:color="CCCCCC" w:sz="1"/>
+              <w:bottom w:val="single" w:color="CCCCCC" w:sz="1"/>
+              <w:right w:val="single" w:color="CCCCCC" w:sz="1"/>
+            </w:tcBorders>
+            <w:tcMar>
+              <w:top w:type="dxa" w:w="80"/>
+              <w:left w:type="dxa" w:w="120"/>
+              <w:bottom w:type="dxa" w:w="80"/>
+              <w:right w:type="dxa" w:w="120"/>
+            </w:tcMar>
+          </w:tcPr>
+          <w:p>
+            <w:r>
+              <w:rPr>
+                <w:rFonts w:ascii="Arial" w:cs="Arial" w:eastAsia="Arial" w:hAnsi="Arial"/>
+                <w:sz w:val="18"/>
+                <w:szCs w:val="18"/>
+              </w:rPr>
+              <w:t xml:space="preserve">SWFL</w:t>
+            </w:r>
+          </w:p>
+        </w:tc>
+      </w:tr>
+      <w:tr>
+        <w:tc>
+          <w:tcPr>
+            <w:tcW w:type="dxa" w:w="1800"/>
+            <w:tcBorders>
+              <w:top w:val="single" w:color="CCCCCC" w:sz="1"/>
+              <w:left w:val="single" w:color="CCCCCC" w:sz="1"/>
+              <w:bottom w:val="single" w:color="CCCCCC" w:sz="1"/>
+              <w:right w:val="single" w:color="CCCCCC" w:sz="1"/>
+            </w:tcBorders>
+            <w:shd w:fill="F2F3F4" w:val="clear"/>
+            <w:tcMar>
+              <w:top w:type="dxa" w:w="80"/>
+              <w:left w:type="dxa" w:w="120"/>
+              <w:bottom w:type="dxa" w:w="80"/>
+              <w:right w:type="dxa" w:w="120"/>
+            </w:tcMar>
+          </w:tcPr>
+          <w:p>
+            <w:r>
+              <w:rPr>
+                <w:rFonts w:ascii="Arial" w:cs="Arial" w:eastAsia="Arial" w:hAnsi="Arial"/>
+                <w:b/>
+                <w:bCs/>
+                <w:sz w:val="18"/>
+                <w:szCs w:val="18"/>
+              </w:rPr>
+              <w:t xml:space="preserve">Cuisine / Type</w:t>
+            </w:r>
+          </w:p>
+        </w:tc>
+        <w:tc>
+          <w:tcPr>
+            <w:tcW w:type="dxa" w:w="7560"/>
+            <w:tcBorders>
+              <w:top w:val="single" w:color="CCCCCC" w:sz="1"/>
+              <w:left w:val="single" w:color="CCCCCC" w:sz="1"/>
+              <w:bottom w:val="single" w:color="CCCCCC" w:sz="1"/>
+              <w:right w:val="single" w:color="CCCCCC" w:sz="1"/>
+            </w:tcBorders>
+            <w:tcMar>
+              <w:top w:type="dxa" w:w="80"/>
+              <w:left w:type="dxa" w:w="120"/>
+              <w:bottom w:type="dxa" w:w="80"/>
+              <w:right w:type="dxa" w:w="120"/>
+            </w:tcMar>
+          </w:tcPr>
+          <w:p>
+            <w:r>
+              <w:rPr>
+                <w:rFonts w:ascii="Arial" w:cs="Arial" w:eastAsia="Arial" w:hAnsi="Arial"/>
+                <w:sz w:val="18"/>
+                <w:szCs w:val="18"/>
+              </w:rPr>
+              <w:t xml:space="preserve">Frozen / dessert</w:t>
+            </w:r>
+          </w:p>
+        </w:tc>
+      </w:tr>
+      <w:tr>
+        <w:tc>
+          <w:tcPr>
+            <w:tcW w:type="dxa" w:w="1800"/>
+            <w:tcBorders>
+              <w:top w:val="single" w:color="CCCCCC" w:sz="1"/>
+              <w:left w:val="single" w:color="CCCCCC" w:sz="1"/>
+              <w:bottom w:val="single" w:color="CCCCCC" w:sz="1"/>
+              <w:right w:val="single" w:color="CCCCCC" w:sz="1"/>
+            </w:tcBorders>
+            <w:shd w:fill="F2F3F4" w:val="clear"/>
+            <w:tcMar>
+              <w:top w:type="dxa" w:w="80"/>
+              <w:left w:type="dxa" w:w="120"/>
+              <w:bottom w:type="dxa" w:w="80"/>
+              <w:right w:type="dxa" w:w="120"/>
+            </w:tcMar>
+          </w:tcPr>
+          <w:p>
+            <w:r>
+              <w:rPr>
+                <w:rFonts w:ascii="Arial" w:cs="Arial" w:eastAsia="Arial" w:hAnsi="Arial"/>
+                <w:b/>
+                <w:bCs/>
+                <w:sz w:val="18"/>
+                <w:szCs w:val="18"/>
+              </w:rPr>
+              <w:t xml:space="preserve">Notes</w:t>
+            </w:r>
+          </w:p>
+        </w:tc>
+        <w:tc>
+          <w:tcPr>
+            <w:tcW w:type="dxa" w:w="7560"/>
+            <w:tcBorders>
+              <w:top w:val="single" w:color="CCCCCC" w:sz="1"/>
+              <w:left w:val="single" w:color="CCCCCC" w:sz="1"/>
+              <w:bottom w:val="single" w:color="CCCCCC" w:sz="1"/>
+              <w:right w:val="single" w:color="CCCCCC" w:sz="1"/>
+            </w:tcBorders>
+            <w:tcMar>
+              <w:top w:type="dxa" w:w="80"/>
+              <w:left w:type="dxa" w:w="120"/>
+              <w:bottom w:type="dxa" w:w="80"/>
+              <w:right w:type="dxa" w:w="120"/>
+            </w:tcMar>
+          </w:tcPr>
+          <w:p>
+            <w:r>
+              <w:rPr>
+                <w:rFonts w:ascii="Arial" w:cs="Arial" w:eastAsia="Arial" w:hAnsi="Arial"/>
+                <w:sz w:val="18"/>
+                <w:szCs w:val="18"/>
+              </w:rPr>
+              <w:t xml:space="preserve">[2026-04-06] Easter wrap-up post. Zero engagement on booking pitch. Actively seeking event bookings. Potential early-adopter target for platform.</w:t>
+            </w:r>
+          </w:p>
+        </w:tc>
+      </w:tr>
+    </w:tbl>
+    <w:p>
+      <w:pPr>
+        <w:spacing w:after="60" w:before="60"/>
+      </w:pPr>
+      <w:r>
+        <w:t xml:space="preserve"/>
+      </w:r>
+    </w:p>
+    <w:p>
+      <w:pPr>
+        <w:pStyle w:val="Heading2"/>
+        <w:pBdr>
+          <w:bottom w:val="single" w:color="1B4F72" w:sz="4"/>
+        </w:pBdr>
+        <w:spacing w:after="60" w:before="320"/>
+      </w:pPr>
+      <w:r>
+        <w:rPr>
+          <w:rFonts w:ascii="Arial" w:cs="Arial" w:eastAsia="Arial" w:hAnsi="Arial"/>
+          <w:b/>
+          <w:bCs/>
+          <w:color w:val="1B4F72"/>
+          <w:sz w:val="26"/>
+          <w:szCs w:val="26"/>
+        </w:rPr>
+        <w:t xml:space="preserve">Diego Botero</w:t>
+      </w:r>
+    </w:p>
+    <w:tbl>
+      <w:tblPr>
+        <w:tblW w:type="dxa" w:w="9360"/>
+        <w:tblBorders>
+          <w:top w:val="single" w:color="auto" w:sz="4"/>
+          <w:left w:val="single" w:color="auto" w:sz="4"/>
+          <w:bottom w:val="single" w:color="auto" w:sz="4"/>
+          <w:right w:val="single" w:color="auto" w:sz="4"/>
+          <w:insideH w:val="single" w:color="auto" w:sz="4"/>
+          <w:insideV w:val="single" w:color="auto" w:sz="4"/>
+        </w:tblBorders>
+      </w:tblPr>
+      <w:tblGrid>
+        <w:gridCol w:w="1800"/>
+        <w:gridCol w:w="7560"/>
+      </w:tblGrid>
+      <w:tr>
+        <w:tc>
+          <w:tcPr>
+            <w:tcW w:type="dxa" w:w="1800"/>
+            <w:tcBorders>
+              <w:top w:val="single" w:color="CCCCCC" w:sz="1"/>
+              <w:left w:val="single" w:color="CCCCCC" w:sz="1"/>
+              <w:bottom w:val="single" w:color="CCCCCC" w:sz="1"/>
+              <w:right w:val="single" w:color="CCCCCC" w:sz="1"/>
+            </w:tcBorders>
+            <w:shd w:fill="F2F3F4" w:val="clear"/>
+            <w:tcMar>
+              <w:top w:type="dxa" w:w="80"/>
+              <w:left w:type="dxa" w:w="120"/>
+              <w:bottom w:type="dxa" w:w="80"/>
+              <w:right w:type="dxa" w:w="120"/>
+            </w:tcMar>
+          </w:tcPr>
+          <w:p>
+            <w:r>
+              <w:rPr>
+                <w:rFonts w:ascii="Arial" w:cs="Arial" w:eastAsia="Arial" w:hAnsi="Arial"/>
+                <w:b/>
+                <w:bCs/>
+                <w:sz w:val="18"/>
+                <w:szCs w:val="18"/>
+              </w:rPr>
+              <w:t xml:space="preserve">Owner / Operator</w:t>
+            </w:r>
+          </w:p>
+        </w:tc>
+        <w:tc>
+          <w:tcPr>
+            <w:tcW w:type="dxa" w:w="7560"/>
+            <w:tcBorders>
+              <w:top w:val="single" w:color="CCCCCC" w:sz="1"/>
+              <w:left w:val="single" w:color="CCCCCC" w:sz="1"/>
+              <w:bottom w:val="single" w:color="CCCCCC" w:sz="1"/>
+              <w:right w:val="single" w:color="CCCCCC" w:sz="1"/>
+            </w:tcBorders>
+            <w:tcMar>
+              <w:top w:type="dxa" w:w="80"/>
+              <w:left w:type="dxa" w:w="120"/>
+              <w:bottom w:type="dxa" w:w="80"/>
+              <w:right w:type="dxa" w:w="120"/>
+            </w:tcMar>
+          </w:tcPr>
+          <w:p>
+            <w:r>
+              <w:rPr>
+                <w:rFonts w:ascii="Arial" w:cs="Arial" w:eastAsia="Arial" w:hAnsi="Arial"/>
+                <w:sz w:val="18"/>
+                <w:szCs w:val="18"/>
+              </w:rPr>
+              <w:t xml:space="preserve">Diego Botero</w:t>
+            </w:r>
+          </w:p>
+        </w:tc>
+      </w:tr>
+      <w:tr>
+        <w:tc>
+          <w:tcPr>
+            <w:tcW w:type="dxa" w:w="1800"/>
+            <w:tcBorders>
+              <w:top w:val="single" w:color="CCCCCC" w:sz="1"/>
+              <w:left w:val="single" w:color="CCCCCC" w:sz="1"/>
+              <w:bottom w:val="single" w:color="CCCCCC" w:sz="1"/>
+              <w:right w:val="single" w:color="CCCCCC" w:sz="1"/>
+            </w:tcBorders>
+            <w:shd w:fill="F2F3F4" w:val="clear"/>
+            <w:tcMar>
+              <w:top w:type="dxa" w:w="80"/>
+              <w:left w:type="dxa" w:w="120"/>
+              <w:bottom w:type="dxa" w:w="80"/>
+              <w:right w:type="dxa" w:w="120"/>
+            </w:tcMar>
+          </w:tcPr>
+          <w:p>
+            <w:r>
+              <w:rPr>
+                <w:rFonts w:ascii="Arial" w:cs="Arial" w:eastAsia="Arial" w:hAnsi="Arial"/>
+                <w:b/>
+                <w:bCs/>
+                <w:sz w:val="18"/>
+                <w:szCs w:val="18"/>
+              </w:rPr>
+              <w:t xml:space="preserve">Primary Contact</w:t>
+            </w:r>
+          </w:p>
+        </w:tc>
+        <w:tc>
+          <w:tcPr>
+            <w:tcW w:type="dxa" w:w="7560"/>
+            <w:tcBorders>
+              <w:top w:val="single" w:color="CCCCCC" w:sz="1"/>
+              <w:left w:val="single" w:color="CCCCCC" w:sz="1"/>
+              <w:bottom w:val="single" w:color="CCCCCC" w:sz="1"/>
+              <w:right w:val="single" w:color="CCCCCC" w:sz="1"/>
+            </w:tcBorders>
+            <w:tcMar>
+              <w:top w:type="dxa" w:w="80"/>
+              <w:left w:type="dxa" w:w="120"/>
+              <w:bottom w:type="dxa" w:w="80"/>
+              <w:right w:type="dxa" w:w="120"/>
+            </w:tcMar>
+          </w:tcPr>
+          <w:p>
+            <w:r>
+              <w:rPr>
+                <w:rFonts w:ascii="Arial" w:cs="Arial" w:eastAsia="Arial" w:hAnsi="Arial"/>
+                <w:sz w:val="18"/>
+                <w:szCs w:val="18"/>
+              </w:rPr>
+              <w:t xml:space="preserve">Diego Botero</w:t>
+            </w:r>
+          </w:p>
+        </w:tc>
+      </w:tr>
+      <w:tr>
+        <w:tc>
+          <w:tcPr>
+            <w:tcW w:type="dxa" w:w="1800"/>
+            <w:tcBorders>
+              <w:top w:val="single" w:color="CCCCCC" w:sz="1"/>
+              <w:left w:val="single" w:color="CCCCCC" w:sz="1"/>
+              <w:bottom w:val="single" w:color="CCCCCC" w:sz="1"/>
+              <w:right w:val="single" w:color="CCCCCC" w:sz="1"/>
+            </w:tcBorders>
+            <w:shd w:fill="F2F3F4" w:val="clear"/>
+            <w:tcMar>
+              <w:top w:type="dxa" w:w="80"/>
+              <w:left w:type="dxa" w:w="120"/>
+              <w:bottom w:type="dxa" w:w="80"/>
+              <w:right w:type="dxa" w:w="120"/>
+            </w:tcMar>
+          </w:tcPr>
+          <w:p>
+            <w:r>
+              <w:rPr>
+                <w:rFonts w:ascii="Arial" w:cs="Arial" w:eastAsia="Arial" w:hAnsi="Arial"/>
+                <w:b/>
+                <w:bCs/>
+                <w:sz w:val="18"/>
+                <w:szCs w:val="18"/>
+              </w:rPr>
+              <w:t xml:space="preserve">Source</w:t>
+            </w:r>
+          </w:p>
+        </w:tc>
+        <w:tc>
+          <w:tcPr>
+            <w:tcW w:type="dxa" w:w="7560"/>
+            <w:tcBorders>
+              <w:top w:val="single" w:color="CCCCCC" w:sz="1"/>
+              <w:left w:val="single" w:color="CCCCCC" w:sz="1"/>
+              <w:bottom w:val="single" w:color="CCCCCC" w:sz="1"/>
+              <w:right w:val="single" w:color="CCCCCC" w:sz="1"/>
+            </w:tcBorders>
+            <w:tcMar>
+              <w:top w:type="dxa" w:w="80"/>
+              <w:left w:type="dxa" w:w="120"/>
+              <w:bottom w:type="dxa" w:w="80"/>
+              <w:right w:type="dxa" w:w="120"/>
+            </w:tcMar>
+          </w:tcPr>
+          <w:p>
+            <w:r>
+              <w:rPr>
+                <w:rFonts w:ascii="Arial" w:cs="Arial" w:eastAsia="Arial" w:hAnsi="Arial"/>
+                <w:sz w:val="18"/>
+                <w:szCs w:val="18"/>
+              </w:rPr>
+              <w:t xml:space="preserve">Collier &amp; Lee County Food Trucks</w:t>
+            </w:r>
+          </w:p>
+        </w:tc>
+      </w:tr>
+      <w:tr>
+        <w:tc>
+          <w:tcPr>
+            <w:tcW w:type="dxa" w:w="1800"/>
+            <w:tcBorders>
+              <w:top w:val="single" w:color="CCCCCC" w:sz="1"/>
+              <w:left w:val="single" w:color="CCCCCC" w:sz="1"/>
+              <w:bottom w:val="single" w:color="CCCCCC" w:sz="1"/>
+              <w:right w:val="single" w:color="CCCCCC" w:sz="1"/>
+            </w:tcBorders>
+            <w:shd w:fill="F2F3F4" w:val="clear"/>
+            <w:tcMar>
+              <w:top w:type="dxa" w:w="80"/>
+              <w:left w:type="dxa" w:w="120"/>
+              <w:bottom w:type="dxa" w:w="80"/>
+              <w:right w:type="dxa" w:w="120"/>
+            </w:tcMar>
+          </w:tcPr>
+          <w:p>
+            <w:r>
+              <w:rPr>
+                <w:rFonts w:ascii="Arial" w:cs="Arial" w:eastAsia="Arial" w:hAnsi="Arial"/>
+                <w:b/>
+                <w:bCs/>
+                <w:sz w:val="18"/>
+                <w:szCs w:val="18"/>
+              </w:rPr>
+              <w:t xml:space="preserve">Facebook</w:t>
+            </w:r>
+          </w:p>
+        </w:tc>
+        <w:tc>
+          <w:tcPr>
+            <w:tcW w:type="dxa" w:w="7560"/>
+            <w:tcBorders>
+              <w:top w:val="single" w:color="CCCCCC" w:sz="1"/>
+              <w:left w:val="single" w:color="CCCCCC" w:sz="1"/>
+              <w:bottom w:val="single" w:color="CCCCCC" w:sz="1"/>
+              <w:right w:val="single" w:color="CCCCCC" w:sz="1"/>
+            </w:tcBorders>
+            <w:tcMar>
+              <w:top w:type="dxa" w:w="80"/>
+              <w:left w:type="dxa" w:w="120"/>
+              <w:bottom w:type="dxa" w:w="80"/>
+              <w:right w:type="dxa" w:w="120"/>
+            </w:tcMar>
+          </w:tcPr>
+          <w:p>
+            <w:r>
+              <w:rPr>
+                <w:rFonts w:ascii="Arial" w:cs="Arial" w:eastAsia="Arial" w:hAnsi="Arial"/>
+                <w:sz w:val="18"/>
+                <w:szCs w:val="18"/>
+              </w:rPr>
+              <w:t xml:space="preserve">Diego Botero</w:t>
+            </w:r>
+          </w:p>
+        </w:tc>
+      </w:tr>
+      <w:tr>
+        <w:tc>
+          <w:tcPr>
+            <w:tcW w:type="dxa" w:w="1800"/>
+            <w:tcBorders>
+              <w:top w:val="single" w:color="CCCCCC" w:sz="1"/>
+              <w:left w:val="single" w:color="CCCCCC" w:sz="1"/>
+              <w:bottom w:val="single" w:color="CCCCCC" w:sz="1"/>
+              <w:right w:val="single" w:color="CCCCCC" w:sz="1"/>
+            </w:tcBorders>
+            <w:shd w:fill="F2F3F4" w:val="clear"/>
+            <w:tcMar>
+              <w:top w:type="dxa" w:w="80"/>
+              <w:left w:type="dxa" w:w="120"/>
+              <w:bottom w:type="dxa" w:w="80"/>
+              <w:right w:type="dxa" w:w="120"/>
+            </w:tcMar>
+          </w:tcPr>
+          <w:p>
+            <w:r>
+              <w:rPr>
+                <w:rFonts w:ascii="Arial" w:cs="Arial" w:eastAsia="Arial" w:hAnsi="Arial"/>
+                <w:b/>
+                <w:bCs/>
+                <w:sz w:val="18"/>
+                <w:szCs w:val="18"/>
+              </w:rPr>
+              <w:t xml:space="preserve">Location</w:t>
+            </w:r>
+          </w:p>
+        </w:tc>
+        <w:tc>
+          <w:tcPr>
+            <w:tcW w:type="dxa" w:w="7560"/>
+            <w:tcBorders>
+              <w:top w:val="single" w:color="CCCCCC" w:sz="1"/>
+              <w:left w:val="single" w:color="CCCCCC" w:sz="1"/>
+              <w:bottom w:val="single" w:color="CCCCCC" w:sz="1"/>
+              <w:right w:val="single" w:color="CCCCCC" w:sz="1"/>
+            </w:tcBorders>
+            <w:tcMar>
+              <w:top w:type="dxa" w:w="80"/>
+              <w:left w:type="dxa" w:w="120"/>
+              <w:bottom w:type="dxa" w:w="80"/>
+              <w:right w:type="dxa" w:w="120"/>
+            </w:tcMar>
+          </w:tcPr>
+          <w:p>
+            <w:r>
+              <w:rPr>
+                <w:rFonts w:ascii="Arial" w:cs="Arial" w:eastAsia="Arial" w:hAnsi="Arial"/>
+                <w:sz w:val="18"/>
+                <w:szCs w:val="18"/>
+              </w:rPr>
+              <w:t xml:space="preserve">SWFL</w:t>
+            </w:r>
+          </w:p>
+        </w:tc>
+      </w:tr>
+      <w:tr>
+        <w:tc>
+          <w:tcPr>
+            <w:tcW w:type="dxa" w:w="1800"/>
+            <w:tcBorders>
+              <w:top w:val="single" w:color="CCCCCC" w:sz="1"/>
+              <w:left w:val="single" w:color="CCCCCC" w:sz="1"/>
+              <w:bottom w:val="single" w:color="CCCCCC" w:sz="1"/>
+              <w:right w:val="single" w:color="CCCCCC" w:sz="1"/>
+            </w:tcBorders>
+            <w:shd w:fill="F2F3F4" w:val="clear"/>
+            <w:tcMar>
+              <w:top w:type="dxa" w:w="80"/>
+              <w:left w:type="dxa" w:w="120"/>
+              <w:bottom w:type="dxa" w:w="80"/>
+              <w:right w:type="dxa" w:w="120"/>
+            </w:tcMar>
+          </w:tcPr>
+          <w:p>
+            <w:r>
+              <w:rPr>
+                <w:rFonts w:ascii="Arial" w:cs="Arial" w:eastAsia="Arial" w:hAnsi="Arial"/>
+                <w:b/>
+                <w:bCs/>
+                <w:sz w:val="18"/>
+                <w:szCs w:val="18"/>
+              </w:rPr>
+              <w:t xml:space="preserve">Notes</w:t>
+            </w:r>
+          </w:p>
+        </w:tc>
+        <w:tc>
+          <w:tcPr>
+            <w:tcW w:type="dxa" w:w="7560"/>
+            <w:tcBorders>
+              <w:top w:val="single" w:color="CCCCCC" w:sz="1"/>
+              <w:left w:val="single" w:color="CCCCCC" w:sz="1"/>
+              <w:bottom w:val="single" w:color="CCCCCC" w:sz="1"/>
+              <w:right w:val="single" w:color="CCCCCC" w:sz="1"/>
+            </w:tcBorders>
+            <w:tcMar>
+              <w:top w:type="dxa" w:w="80"/>
+              <w:left w:type="dxa" w:w="120"/>
+              <w:bottom w:type="dxa" w:w="80"/>
+              <w:right w:type="dxa" w:w="120"/>
+            </w:tcMar>
+          </w:tcPr>
+          <w:p>
+            <w:r>
+              <w:rPr>
+                <w:rFonts w:ascii="Arial" w:cs="Arial" w:eastAsia="Arial" w:hAnsi="Arial"/>
+                <w:sz w:val="18"/>
+                <w:szCs w:val="18"/>
+              </w:rPr>
+              <w:t xml:space="preserve">[2026-04-06] Now booking April-May. Proactive availability post. DM via Facebook for inquiries.</w:t>
+            </w:r>
+          </w:p>
+        </w:tc>
+      </w:tr>
+    </w:tbl>
+    <w:p>
+      <w:pPr>
+        <w:spacing w:after="60" w:before="60"/>
+      </w:pPr>
+      <w:r>
+        <w:t xml:space="preserve"/>
+      </w:r>
+    </w:p>
     <w:sectPr>
-      <w:pgSz w:w="11906" w:h="16838" w:orient="portrait"/>
-      <w:pgMar w:top="1440" w:right="1440" w:bottom="1440" w:left="1440" w:header="708" w:footer="708" w:gutter="0"/>
+      <w:footerReference w:type="default" r:id="rId7"/>
+      <w:pgSz w:w="12240" w:h="15840" w:orient="portrait"/>
+      <w:pgMar w:top="1080" w:right="1080" w:bottom="1080" w:left="1080" w:header="708" w:footer="708" w:gutter="0"/>
       <w:pgNumType/>
       <w:docGrid w:linePitch="360"/>
     </w:sectPr>
@@ -20185,6 +21410,37 @@
     </w:p>
   </w:endnote>
 </w:endnotes>
+</file>
+
+<file path=word/footer1.xml><?xml version="1.0" encoding="utf-8"?>
+<w:ftr xmlns:wpc="http://schemas.microsoft.com/office/word/2010/wordprocessingCanvas" xmlns:mc="http://schemas.openxmlformats.org/markup-compatibility/2006" xmlns:o="urn:schemas-microsoft-com:office:office" xmlns:r="http://schemas.openxmlformats.org/officeDocument/2006/relationships" xmlns:m="http://schemas.openxmlformats.org/officeDocument/2006/math" xmlns:v="urn:schemas-microsoft-com:vml" xmlns:wp14="http://schemas.microsoft.com/office/word/2010/wordprocessingDrawing" xmlns:wp="http://schemas.openxmlformats.org/drawingml/2006/wordprocessingDrawing" xmlns:w10="urn:schemas-microsoft-com:office:word" xmlns:w="http://schemas.openxmlformats.org/wordprocessingml/2006/main" xmlns:w14="http://schemas.microsoft.com/office/word/2010/wordml" xmlns:w15="http://schemas.microsoft.com/office/word/2012/wordml" xmlns:wpg="http://schemas.microsoft.com/office/word/2010/wordprocessingGroup" xmlns:wpi="http://schemas.microsoft.com/office/word/2010/wordprocessingInk" xmlns:wne="http://schemas.microsoft.com/office/word/2006/wordml" xmlns:wps="http://schemas.microsoft.com/office/word/2010/wordprocessingShape">
+  <w:p>
+    <w:pPr>
+      <w:jc w:val="center"/>
+    </w:pPr>
+    <w:r>
+      <w:rPr>
+        <w:rFonts w:ascii="Arial" w:cs="Arial" w:eastAsia="Arial" w:hAnsi="Arial"/>
+        <w:color w:val="7F8C8D"/>
+        <w:sz w:val="16"/>
+        <w:szCs w:val="16"/>
+      </w:rPr>
+      <w:t xml:space="preserve">Food Trucks  |  ServiceWindow Market Research  |  Page </w:t>
+    </w:r>
+    <w:r>
+      <w:rPr>
+        <w:rFonts w:ascii="Arial" w:cs="Arial" w:eastAsia="Arial" w:hAnsi="Arial"/>
+        <w:color w:val="7F8C8D"/>
+        <w:sz w:val="16"/>
+        <w:szCs w:val="16"/>
+      </w:rPr>
+      <w:fldChar w:fldCharType="begin"/>
+      <w:instrText xml:space="preserve">PAGE</w:instrText>
+      <w:fldChar w:fldCharType="separate"/>
+      <w:fldChar w:fldCharType="end"/>
+    </w:r>
+  </w:p>
+</w:ftr>
 </file>
 
 <file path=word/footnotes.xml><?xml version="1.0" encoding="utf-8"?>

</xml_diff>